<commit_message>
fix(paper): actually swap the author name this time
Previous commit's message claimed the author was changed but the diff only
touched risk-indexing content -- the author line was still "Kiran Kamate"
in both docx build scripts. Corrected to "Shifali Doshi" as sole author,
per the explicit instruction to drop Kiran and keep only Doshi. Designation
left as a bracketed placeholder rather than asserting "Student" without
knowing her actual role.
</commit_message>
<xml_diff>
--- a/docs/paper/IJSRSET_paper1_proposed_system.docx
+++ b/docs/paper/IJSRSET_paper1_proposed_system.docx
@@ -31,7 +31,7 @@
           <w:sz w:val="22"/>
           <w:szCs w:val="22"/>
         </w:rPr>
-        <w:t xml:space="preserve">Kiran Kamate*1, [Guide Name]2</w:t>
+        <w:t xml:space="preserve">Shifali Doshi*1</w:t>
       </w:r>
     </w:p>
     <w:p>
@@ -47,23 +47,7 @@
           <w:sz w:val="20"/>
           <w:szCs w:val="20"/>
         </w:rPr>
-        <w:t xml:space="preserve">*1Student, Department of Computer Science &amp; Engineering, Walchand Institute of Technology, Solapur, Maharashtra, India</w:t>
-      </w:r>
-    </w:p>
-    <w:p>
-      <w:pPr>
-        <w:spacing w:after="20"/>
-        <w:jc w:val="center"/>
-      </w:pPr>
-      <w:r>
-        <w:rPr>
-          <w:rFonts w:ascii="Times New Roman" w:cs="Times New Roman" w:eastAsia="Times New Roman" w:hAnsi="Times New Roman"/>
-          <w:i/>
-          <w:iCs/>
-          <w:sz w:val="20"/>
-          <w:szCs w:val="20"/>
-        </w:rPr>
-        <w:t xml:space="preserve">2[Designation], Department of Computer Science &amp; Engineering, Walchand Institute of Technology, Solapur, Maharashtra, India</w:t>
+        <w:t xml:space="preserve">*1[Designation], Department of Computer Science &amp; Engineering, Walchand Institute of Technology, Solapur, Maharashtra, India</w:t>
       </w:r>
     </w:p>
     <w:p>

</xml_diff>